<commit_message>
added changes, testing, readme and docker updates.
</commit_message>
<xml_diff>
--- a/Reflection.docx
+++ b/Reflection.docx
@@ -23,31 +23,9 @@
         <w:t xml:space="preserve"> application </w:t>
       </w:r>
       <w:r>
-        <w:t xml:space="preserve">connect to one another. From the </w:t>
-      </w:r>
-      <w:r>
-        <w:t xml:space="preserve">database </w:t>
-      </w:r>
-      <w:r>
-        <w:t xml:space="preserve">side of things when it comes to </w:t>
-      </w:r>
-      <w:r>
-        <w:t xml:space="preserve">modeling </w:t>
-      </w:r>
-      <w:r>
-        <w:t xml:space="preserve">to parts of </w:t>
-      </w:r>
-      <w:r>
-        <w:t xml:space="preserve">data validation </w:t>
-      </w:r>
-      <w:r>
-        <w:t>for</w:t>
-      </w:r>
-      <w:r>
-        <w:t xml:space="preserve"> automated testing and deployment.</w:t>
-      </w:r>
-      <w:r>
-        <w:br/>
+        <w:t xml:space="preserve">connect to one another. </w:t>
+      </w:r>
+      <w:r>
         <w:t xml:space="preserve">I learned how to design a secure </w:t>
       </w:r>
       <w:proofErr w:type="spellStart"/>
@@ -67,27 +45,11 @@
       <w:r>
         <w:t xml:space="preserve"> which was a learning curve </w:t>
       </w:r>
-      <w:proofErr w:type="gramStart"/>
-      <w:r>
-        <w:t>in itself to</w:t>
-      </w:r>
-      <w:proofErr w:type="gramEnd"/>
-      <w:r>
-        <w:t xml:space="preserve"> figure out how to use and implement. Another was the usage of </w:t>
-      </w:r>
-      <w:proofErr w:type="spellStart"/>
-      <w:r>
-        <w:t>Pydantic</w:t>
-      </w:r>
-      <w:proofErr w:type="spellEnd"/>
-      <w:r>
-        <w:t xml:space="preserve"> schemas </w:t>
-      </w:r>
-      <w:r>
-        <w:t xml:space="preserve">in which its goal is </w:t>
-      </w:r>
-      <w:r>
-        <w:t>to control what data is exposed to users.</w:t>
+      <w:r>
+        <w:t>to</w:t>
+      </w:r>
+      <w:r>
+        <w:t xml:space="preserve"> figure out how to use and implement. </w:t>
       </w:r>
     </w:p>
     <w:p>
@@ -145,18 +107,15 @@
       <w:r>
         <w:t xml:space="preserve"> itself. </w:t>
       </w:r>
-      <w:proofErr w:type="gramStart"/>
-      <w:r>
-        <w:t>Its</w:t>
-      </w:r>
-      <w:proofErr w:type="gramEnd"/>
+      <w:r>
+        <w:t>It’s</w:t>
+      </w:r>
       <w:r>
         <w:t xml:space="preserve"> an incredible benchmark to</w:t>
       </w:r>
       <w:r>
         <w:t xml:space="preserve"> </w:t>
       </w:r>
-      <w:proofErr w:type="gramStart"/>
       <w:r>
         <w:t>ensur</w:t>
       </w:r>
@@ -167,99 +126,139 @@
         <w:t xml:space="preserve"> </w:t>
       </w:r>
       <w:r>
-        <w:t>myself</w:t>
-      </w:r>
-      <w:proofErr w:type="gramEnd"/>
+        <w:t>that every</w:t>
+      </w:r>
+      <w:r>
+        <w:t xml:space="preserve"> line of</w:t>
+      </w:r>
+      <w:r>
+        <w:t xml:space="preserve"> code </w:t>
+      </w:r>
+      <w:r>
+        <w:t xml:space="preserve">is not only </w:t>
+      </w:r>
+      <w:r>
+        <w:t>updated</w:t>
+      </w:r>
+      <w:r>
+        <w:t xml:space="preserve"> to that, but I have</w:t>
+      </w:r>
+      <w:r>
+        <w:t xml:space="preserve"> validated</w:t>
+      </w:r>
+      <w:r>
+        <w:t xml:space="preserve"> it properly to avoid any future messes and of course</w:t>
+      </w:r>
+      <w:r>
+        <w:t xml:space="preserve"> ready to run anywhere.</w:t>
+      </w:r>
       <w:r>
         <w:t xml:space="preserve"> </w:t>
       </w:r>
       <w:r>
-        <w:t>that every</w:t>
-      </w:r>
-      <w:r>
-        <w:t xml:space="preserve"> line of</w:t>
-      </w:r>
-      <w:r>
-        <w:t xml:space="preserve"> code </w:t>
-      </w:r>
-      <w:r>
-        <w:t xml:space="preserve">is not only </w:t>
-      </w:r>
-      <w:proofErr w:type="gramStart"/>
-      <w:r>
-        <w:t>update</w:t>
-      </w:r>
-      <w:proofErr w:type="gramEnd"/>
-      <w:r>
-        <w:t xml:space="preserve"> to that, but I have</w:t>
-      </w:r>
-      <w:r>
-        <w:t xml:space="preserve"> validated</w:t>
-      </w:r>
-      <w:r>
-        <w:t xml:space="preserve"> it properly to avoid any future messes and of course</w:t>
-      </w:r>
-      <w:r>
-        <w:t xml:space="preserve"> ready to run anywhere.</w:t>
+        <w:t xml:space="preserve">Through implementing password </w:t>
+      </w:r>
+      <w:r>
+        <w:t>hashing</w:t>
+      </w:r>
+      <w:r>
+        <w:t xml:space="preserve">, however, </w:t>
+      </w:r>
+      <w:r>
+        <w:t xml:space="preserve">I learned how crucial it is to never store plain text passwords and how libraries like </w:t>
+      </w:r>
+      <w:proofErr w:type="spellStart"/>
+      <w:r>
+        <w:t>Passlib</w:t>
+      </w:r>
+      <w:proofErr w:type="spellEnd"/>
+      <w:r>
+        <w:t xml:space="preserve"> simplify </w:t>
+      </w:r>
+      <w:r>
+        <w:t>and create hashes for these. Alongside creating GitHub tokens to make sure no sensitive data is put out there.</w:t>
+      </w:r>
+      <w:r>
+        <w:t xml:space="preserve"> With </w:t>
+      </w:r>
+      <w:proofErr w:type="spellStart"/>
+      <w:r>
+        <w:t>Pydantic</w:t>
+      </w:r>
+      <w:proofErr w:type="spellEnd"/>
+      <w:r>
+        <w:t xml:space="preserve">, I </w:t>
+      </w:r>
+      <w:r>
+        <w:t>saw firsthand</w:t>
+      </w:r>
+      <w:r>
+        <w:t xml:space="preserve"> how powerful data validation </w:t>
+      </w:r>
+      <w:r>
+        <w:t>is and its important at</w:t>
+      </w:r>
+      <w:r>
+        <w:t xml:space="preserve"> preventing invalid or unsafe user input from ever reaching the database</w:t>
+      </w:r>
+      <w:r>
+        <w:t xml:space="preserve">. </w:t>
+      </w:r>
+      <w:r>
+        <w:t>A hurdle I faced was</w:t>
       </w:r>
       <w:r>
         <w:t xml:space="preserve"> </w:t>
       </w:r>
       <w:r>
-        <w:t xml:space="preserve">One </w:t>
-      </w:r>
-      <w:r>
-        <w:t xml:space="preserve">of the many </w:t>
-      </w:r>
-      <w:r>
-        <w:t>challenge</w:t>
-      </w:r>
-      <w:r>
-        <w:t>s</w:t>
-      </w:r>
-      <w:r>
-        <w:t xml:space="preserve"> I faced was configuring PostgreSQL inside the GitHub Actions environment</w:t>
-      </w:r>
-      <w:r>
-        <w:t xml:space="preserve">. It took several attempts, but I made </w:t>
-      </w:r>
-      <w:r>
-        <w:t xml:space="preserve">sure my tests ran correctly in Docker. Fixing connection issues and dependency mismatches </w:t>
-      </w:r>
-      <w:r>
-        <w:t xml:space="preserve">is one of the many references points I used to </w:t>
-      </w:r>
-      <w:r>
-        <w:t>g</w:t>
-      </w:r>
-      <w:r>
-        <w:t>ive</w:t>
-      </w:r>
-      <w:r>
-        <w:t xml:space="preserve"> me a clearer understanding of how containers communicate and how environment variables are managed.</w:t>
-      </w:r>
-    </w:p>
-    <w:p>
-      <w:pPr>
-        <w:ind w:firstLine="720"/>
-      </w:pPr>
+        <w:t>environment variable problems for PostgreSQL in the workflow</w:t>
+      </w:r>
+      <w:r>
+        <w:t>. It took some time, but I managed to</w:t>
+      </w:r>
+      <w:r>
+        <w:t xml:space="preserve"> </w:t>
+      </w:r>
+      <w:r>
+        <w:t>resolve</w:t>
+      </w:r>
+      <w:r>
+        <w:t xml:space="preserve"> </w:t>
+      </w:r>
+      <w:r>
+        <w:t xml:space="preserve">it </w:t>
+      </w:r>
+      <w:r>
+        <w:t>by defining them explicitly in both docker-</w:t>
+      </w:r>
+      <w:proofErr w:type="spellStart"/>
+      <w:r>
+        <w:t>compose.yml</w:t>
+      </w:r>
+      <w:proofErr w:type="spellEnd"/>
+      <w:r>
+        <w:t xml:space="preserve"> and the GitHub Actions YAML file. </w:t>
+      </w:r>
+      <w:r>
+        <w:t xml:space="preserve">It’s crucial to </w:t>
+      </w:r>
+      <w:r>
+        <w:t>maintain consistent environments across local and cloud setups.</w:t>
+      </w:r>
+      <w:r>
+        <w:t xml:space="preserve"> </w:t>
+      </w:r>
       <w:r>
         <w:t>Overall, this project</w:t>
       </w:r>
       <w:r>
-        <w:t xml:space="preserve"> not only</w:t>
-      </w:r>
-      <w:r>
-        <w:t xml:space="preserve"> strengthened my skills in backend development</w:t>
-      </w:r>
-      <w:r>
-        <w:t xml:space="preserve"> but of course more </w:t>
-      </w:r>
-      <w:r>
-        <w:t>DevOps automation</w:t>
-      </w:r>
-      <w:r>
-        <w:t xml:space="preserve"> and helping me understand the security side of things and configurations.</w:t>
+        <w:t xml:space="preserve"> help</w:t>
+      </w:r>
+      <w:r>
+        <w:t>ed</w:t>
+      </w:r>
+      <w:r>
+        <w:t xml:space="preserve"> me understand the security side of things and configurations.</w:t>
       </w:r>
     </w:p>
     <w:sectPr>

</xml_diff>

<commit_message>
added reflection and final changes
</commit_message>
<xml_diff>
--- a/Reflection.docx
+++ b/Reflection.docx
@@ -12,44 +12,81 @@
         <w:ind w:firstLine="720"/>
       </w:pPr>
       <w:r>
-        <w:t xml:space="preserve">Working on this project helped me understand how different parts of a modern </w:t>
-      </w:r>
-      <w:proofErr w:type="spellStart"/>
-      <w:r>
-        <w:t>FastAPI</w:t>
-      </w:r>
-      <w:proofErr w:type="spellEnd"/>
-      <w:r>
-        <w:t xml:space="preserve"> application </w:t>
-      </w:r>
-      <w:r>
-        <w:t xml:space="preserve">connect to one another. </w:t>
-      </w:r>
-      <w:r>
-        <w:t xml:space="preserve">I learned how to design a secure </w:t>
-      </w:r>
-      <w:proofErr w:type="spellStart"/>
-      <w:r>
-        <w:t>SQLAlchemy</w:t>
-      </w:r>
-      <w:proofErr w:type="spellEnd"/>
-      <w:r>
-        <w:t xml:space="preserve"> user model with unique constraints</w:t>
-      </w:r>
-      <w:r>
-        <w:t>. One of which I had to</w:t>
-      </w:r>
-      <w:r>
-        <w:t xml:space="preserve"> integrate password hashing for better security</w:t>
-      </w:r>
-      <w:r>
-        <w:t xml:space="preserve"> which was a learning curve </w:t>
-      </w:r>
-      <w:r>
-        <w:t>to</w:t>
-      </w:r>
-      <w:r>
-        <w:t xml:space="preserve"> figure out how to use and implement. </w:t>
+        <w:t xml:space="preserve">During this module, I developed a fully functional authentication system using JWT, implemented registration and login pages, and integrated Playwright end-to-end tests into </w:t>
+      </w:r>
+      <w:r>
+        <w:t>my existing</w:t>
+      </w:r>
+      <w:r>
+        <w:t xml:space="preserve"> CI/CD pipeline using Docker and GitHub Actions.</w:t>
+      </w:r>
+      <w:r>
+        <w:t xml:space="preserve"> While w</w:t>
+      </w:r>
+      <w:r>
+        <w:t xml:space="preserve">orking on these components </w:t>
+      </w:r>
+      <w:r>
+        <w:t xml:space="preserve">showed me </w:t>
+      </w:r>
+      <w:r>
+        <w:t>how different layers of a modern web application interact</w:t>
+      </w:r>
+      <w:r>
+        <w:t xml:space="preserve"> </w:t>
+      </w:r>
+      <w:r>
+        <w:t xml:space="preserve">from backend development </w:t>
+      </w:r>
+      <w:r>
+        <w:t xml:space="preserve">to </w:t>
+      </w:r>
+      <w:r>
+        <w:t xml:space="preserve">database </w:t>
+      </w:r>
+      <w:r>
+        <w:t>and</w:t>
+      </w:r>
+      <w:r>
+        <w:t xml:space="preserve"> browser automation </w:t>
+      </w:r>
+      <w:r>
+        <w:t>for</w:t>
+      </w:r>
+      <w:r>
+        <w:t xml:space="preserve"> continuous deployment. Implementing </w:t>
+      </w:r>
+      <w:r>
+        <w:t xml:space="preserve">a much more </w:t>
+      </w:r>
+      <w:r>
+        <w:t>secure user registration taught me how password hashing, JWT token generation</w:t>
+      </w:r>
+      <w:r>
+        <w:t xml:space="preserve"> which all was</w:t>
+      </w:r>
+      <w:r>
+        <w:t xml:space="preserve"> important</w:t>
+      </w:r>
+      <w:r>
+        <w:t xml:space="preserve"> as</w:t>
+      </w:r>
+      <w:r>
+        <w:t xml:space="preserve"> </w:t>
+      </w:r>
+      <w:r>
+        <w:t>I had to</w:t>
+      </w:r>
+      <w:r>
+        <w:t xml:space="preserve"> </w:t>
+      </w:r>
+      <w:proofErr w:type="gramStart"/>
+      <w:r>
+        <w:t>handle</w:t>
+      </w:r>
+      <w:proofErr w:type="gramEnd"/>
+      <w:r>
+        <w:t xml:space="preserve"> sensitive information correctly using environment variables instead of hardcoding secrets.</w:t>
       </w:r>
     </w:p>
     <w:p>
@@ -57,208 +94,165 @@
         <w:ind w:firstLine="720"/>
       </w:pPr>
       <w:r>
-        <w:t>Like previous projects s</w:t>
-      </w:r>
-      <w:r>
-        <w:t xml:space="preserve">etting up the CI/CD pipeline </w:t>
-      </w:r>
-      <w:r>
-        <w:t>is</w:t>
-      </w:r>
-      <w:r>
-        <w:t xml:space="preserve"> e</w:t>
-      </w:r>
-      <w:r>
-        <w:t>ssentially</w:t>
-      </w:r>
-      <w:r>
-        <w:t xml:space="preserve"> valuable</w:t>
-      </w:r>
-      <w:r>
-        <w:t xml:space="preserve"> as it’s the running horse of the operations</w:t>
-      </w:r>
+        <w:t xml:space="preserve">One of the major challenges I faced was getting Playwright’s E2E tests to work correctly. Initially, the tests failed </w:t>
+      </w:r>
+      <w:r>
+        <w:t xml:space="preserve">because I checked but did not </w:t>
+      </w:r>
+      <w:r>
+        <w:t>because Playwright was selecting the wrong elements on the page</w:t>
+      </w:r>
+      <w:proofErr w:type="gramStart"/>
       <w:r>
         <w:t xml:space="preserve">. </w:t>
       </w:r>
       <w:r>
-        <w:t>This time around relied more on</w:t>
-      </w:r>
-      <w:r>
-        <w:t xml:space="preserve"> GitHub Actions</w:t>
-      </w:r>
-      <w:r>
-        <w:t xml:space="preserve"> to see where issues arose whether it be with the </w:t>
-      </w:r>
-      <w:r>
-        <w:t>automat</w:t>
-      </w:r>
-      <w:r>
-        <w:t>ing</w:t>
-      </w:r>
-      <w:r>
-        <w:t xml:space="preserve"> testing </w:t>
-      </w:r>
-      <w:r>
-        <w:t>or issues involving the</w:t>
-      </w:r>
-      <w:r>
-        <w:t xml:space="preserve"> Docker image deployment</w:t>
-      </w:r>
-      <w:r>
-        <w:t xml:space="preserve"> itself. </w:t>
-      </w:r>
-      <w:r>
-        <w:t>It’s</w:t>
-      </w:r>
-      <w:r>
-        <w:t xml:space="preserve"> an incredible benchmark to</w:t>
-      </w:r>
-      <w:r>
         <w:t xml:space="preserve"> </w:t>
       </w:r>
-      <w:r>
-        <w:t>ensur</w:t>
-      </w:r>
-      <w:r>
-        <w:t>e</w:t>
+      <w:proofErr w:type="gramEnd"/>
+      <w:r>
+        <w:t>I tried to see what was going on with t</w:t>
+      </w:r>
+      <w:r>
+        <w:t>he button labels</w:t>
+      </w:r>
+      <w:r>
+        <w:t xml:space="preserve"> and if it ma</w:t>
+      </w:r>
+      <w:r>
+        <w:t>tched text inside header tags</w:t>
+      </w:r>
+      <w:r>
+        <w:t>.</w:t>
       </w:r>
       <w:r>
         <w:t xml:space="preserve"> </w:t>
       </w:r>
       <w:r>
-        <w:t>that every</w:t>
-      </w:r>
-      <w:r>
-        <w:t xml:space="preserve"> line of</w:t>
-      </w:r>
-      <w:r>
-        <w:t xml:space="preserve"> code </w:t>
-      </w:r>
-      <w:r>
-        <w:t xml:space="preserve">is not only </w:t>
-      </w:r>
-      <w:r>
-        <w:t>updated</w:t>
-      </w:r>
-      <w:r>
-        <w:t xml:space="preserve"> to that, but I have</w:t>
-      </w:r>
-      <w:r>
-        <w:t xml:space="preserve"> validated</w:t>
-      </w:r>
-      <w:r>
-        <w:t xml:space="preserve"> it properly to avoid any future messes and of course</w:t>
-      </w:r>
-      <w:r>
-        <w:t xml:space="preserve"> ready to run anywhere.</w:t>
+        <w:t xml:space="preserve">Then </w:t>
+      </w:r>
+      <w:r>
+        <w:t xml:space="preserve">I solved </w:t>
+      </w:r>
+      <w:r>
+        <w:t xml:space="preserve">it </w:t>
+      </w:r>
+      <w:r>
+        <w:t xml:space="preserve">by adjusting the headings and ensuring the button text remained </w:t>
+      </w:r>
+      <w:r>
+        <w:t>unchanged,</w:t>
+      </w:r>
+      <w:r>
+        <w:t xml:space="preserve"> but I had to also</w:t>
+      </w:r>
+      <w:r>
+        <w:t xml:space="preserve"> allow</w:t>
       </w:r>
       <w:r>
         <w:t xml:space="preserve"> </w:t>
       </w:r>
       <w:r>
-        <w:t xml:space="preserve">Through implementing password </w:t>
-      </w:r>
-      <w:r>
-        <w:t>hashing</w:t>
-      </w:r>
-      <w:r>
-        <w:t xml:space="preserve">, however, </w:t>
-      </w:r>
-      <w:r>
-        <w:t xml:space="preserve">I learned how crucial it is to never store plain text passwords and how libraries like </w:t>
+        <w:t>the browser automation to identify elements reliably.</w:t>
+      </w:r>
+      <w:r>
+        <w:t xml:space="preserve"> Which was not </w:t>
+      </w:r>
+      <w:proofErr w:type="gramStart"/>
+      <w:r>
+        <w:t>most of</w:t>
+      </w:r>
+      <w:proofErr w:type="gramEnd"/>
+      <w:r>
+        <w:t xml:space="preserve"> it because I had to figure out and see how to solve n</w:t>
+      </w:r>
+      <w:r>
+        <w:t xml:space="preserve">etworking errors such as </w:t>
       </w:r>
       <w:proofErr w:type="spellStart"/>
       <w:r>
-        <w:t>Passlib</w:t>
+        <w:t>net:</w:t>
+      </w:r>
+      <w:r>
+        <w:t>ERR_NAME_NOT_RESOLVED</w:t>
       </w:r>
       <w:proofErr w:type="spellEnd"/>
       <w:r>
-        <w:t xml:space="preserve"> simplify </w:t>
-      </w:r>
-      <w:r>
-        <w:t>and create hashes for these. Alongside creating GitHub tokens to make sure no sensitive data is put out there.</w:t>
-      </w:r>
-      <w:r>
-        <w:t xml:space="preserve"> With </w:t>
-      </w:r>
-      <w:proofErr w:type="spellStart"/>
-      <w:r>
-        <w:t>Pydantic</w:t>
-      </w:r>
-      <w:proofErr w:type="spellEnd"/>
-      <w:r>
-        <w:t xml:space="preserve">, I </w:t>
-      </w:r>
-      <w:r>
-        <w:t>saw firsthand</w:t>
-      </w:r>
-      <w:r>
-        <w:t xml:space="preserve"> how powerful data validation </w:t>
-      </w:r>
-      <w:r>
-        <w:t>is and its important at</w:t>
-      </w:r>
-      <w:r>
-        <w:t xml:space="preserve"> preventing invalid or unsafe user input from ever reaching the database</w:t>
-      </w:r>
-      <w:r>
-        <w:t xml:space="preserve">. </w:t>
-      </w:r>
-      <w:r>
-        <w:t>A hurdle I faced was</w:t>
-      </w:r>
+        <w:t xml:space="preserve">. The cause was that the </w:t>
+      </w:r>
+      <w:r>
+        <w:t>Fast API</w:t>
+      </w:r>
+      <w:r>
+        <w:t xml:space="preserve"> container was not </w:t>
+      </w:r>
+      <w:proofErr w:type="gramStart"/>
+      <w:r>
+        <w:t>being started</w:t>
+      </w:r>
+      <w:proofErr w:type="gramEnd"/>
       <w:r>
         <w:t xml:space="preserve"> </w:t>
       </w:r>
       <w:r>
-        <w:t>environment variable problems for PostgreSQL in the workflow</w:t>
-      </w:r>
-      <w:r>
-        <w:t>. It took some time, but I managed to</w:t>
+        <w:t xml:space="preserve">which I did not know until I ran into it </w:t>
+      </w:r>
+      <w:r>
+        <w:t xml:space="preserve">before </w:t>
+      </w:r>
+      <w:r>
+        <w:t xml:space="preserve">the actual </w:t>
+      </w:r>
+      <w:r>
+        <w:t xml:space="preserve">tests ran. </w:t>
+      </w:r>
+      <w:r>
+        <w:t>So, I had to u</w:t>
+      </w:r>
+      <w:r>
+        <w:t>pdat</w:t>
+      </w:r>
+      <w:r>
+        <w:t xml:space="preserve">e my </w:t>
+      </w:r>
+      <w:r>
+        <w:t>workflow to start all services</w:t>
+      </w:r>
+      <w:r>
+        <w:t xml:space="preserve"> to be ready to </w:t>
+      </w:r>
+      <w:r>
+        <w:t xml:space="preserve">completely </w:t>
+      </w:r>
+      <w:r>
+        <w:t>resolve</w:t>
+      </w:r>
+      <w:r>
+        <w:t xml:space="preserve"> the problem.</w:t>
       </w:r>
       <w:r>
         <w:t xml:space="preserve"> </w:t>
       </w:r>
       <w:r>
-        <w:t>resolve</w:t>
-      </w:r>
-      <w:r>
-        <w:t xml:space="preserve"> </w:t>
-      </w:r>
-      <w:r>
-        <w:t xml:space="preserve">it </w:t>
-      </w:r>
-      <w:r>
-        <w:t>by defining them explicitly in both docker-</w:t>
-      </w:r>
-      <w:proofErr w:type="spellStart"/>
-      <w:r>
-        <w:t>compose.yml</w:t>
-      </w:r>
-      <w:proofErr w:type="spellEnd"/>
-      <w:r>
-        <w:t xml:space="preserve"> and the GitHub Actions YAML file. </w:t>
-      </w:r>
-      <w:r>
-        <w:t xml:space="preserve">It’s crucial to </w:t>
-      </w:r>
-      <w:r>
-        <w:t>maintain consistent environments across local and cloud setups.</w:t>
-      </w:r>
-      <w:r>
-        <w:t xml:space="preserve"> </w:t>
-      </w:r>
-      <w:r>
-        <w:t>Overall, this project</w:t>
-      </w:r>
-      <w:r>
-        <w:t xml:space="preserve"> help</w:t>
-      </w:r>
-      <w:r>
-        <w:t>ed</w:t>
-      </w:r>
-      <w:r>
-        <w:t xml:space="preserve"> me understand the security side of things and configurations.</w:t>
+        <w:t xml:space="preserve">Through this module, </w:t>
+      </w:r>
+      <w:r>
+        <w:t xml:space="preserve">I </w:t>
+      </w:r>
+      <w:r>
+        <w:t xml:space="preserve">have more insight for backend and testing tools. Though </w:t>
+      </w:r>
+      <w:r>
+        <w:t>it</w:t>
+      </w:r>
+      <w:r>
+        <w:t xml:space="preserve"> was a challenging </w:t>
+      </w:r>
+      <w:r>
+        <w:t>experience,</w:t>
+      </w:r>
+      <w:r>
+        <w:t xml:space="preserve"> through trial and error I was able to refine it and manage my application to run automatically with docker hub and GitHub. It was a very trial and error sort of assignment, but it only furthered my learning in how well I know automating testing and practices. </w:t>
       </w:r>
     </w:p>
     <w:sectPr>

</xml_diff>